<commit_message>
Update requirements.txt for package version flexibility and modify Apple and St. Petersburg CDP reports
</commit_message>
<xml_diff>
--- a/Apple_CDP_report.docx
+++ b/Apple_CDP_report.docx
@@ -671,7 +671,7 @@
               <w:rPr>
                 <w:rFonts w:ascii="Times New Roman" w:hAnsi="Times New Roman" w:cs="Times New Roman"/>
               </w:rPr>
-              <w:t>55,300</w:t>
+              <w:t>47,430</w:t>
             </w:r>
           </w:p>
         </w:tc>
@@ -1487,7 +1487,19 @@
               <w:rPr>
                 <w:rFonts w:ascii="Times New Roman" w:hAnsi="Times New Roman" w:cs="Times New Roman"/>
               </w:rPr>
-              <w:t>890,000</w:t>
+              <w:t>890,</w:t>
+            </w:r>
+            <w:r>
+              <w:rPr>
+                <w:rFonts w:ascii="Times New Roman" w:hAnsi="Times New Roman" w:cs="Times New Roman"/>
+              </w:rPr>
+              <w:t>2</w:t>
+            </w:r>
+            <w:r>
+              <w:rPr>
+                <w:rFonts w:ascii="Times New Roman" w:hAnsi="Times New Roman" w:cs="Times New Roman"/>
+              </w:rPr>
+              <w:t>00</w:t>
             </w:r>
           </w:p>
         </w:tc>
@@ -1531,7 +1543,25 @@
               <w:rPr>
                 <w:rFonts w:ascii="Times New Roman" w:hAnsi="Times New Roman" w:cs="Times New Roman"/>
               </w:rPr>
-              <w:t>1,000,000</w:t>
+              <w:t>1,00</w:t>
+            </w:r>
+            <w:r>
+              <w:rPr>
+                <w:rFonts w:ascii="Times New Roman" w:hAnsi="Times New Roman" w:cs="Times New Roman"/>
+              </w:rPr>
+              <w:t>3</w:t>
+            </w:r>
+            <w:r>
+              <w:rPr>
+                <w:rFonts w:ascii="Times New Roman" w:hAnsi="Times New Roman" w:cs="Times New Roman"/>
+              </w:rPr>
+              <w:t>,</w:t>
+            </w:r>
+            <w:r>
+              <w:rPr>
+                <w:rFonts w:ascii="Times New Roman" w:hAnsi="Times New Roman" w:cs="Times New Roman"/>
+              </w:rPr>
+              <w:t>246</w:t>
             </w:r>
           </w:p>
         </w:tc>
@@ -1575,7 +1605,25 @@
               <w:rPr>
                 <w:rFonts w:ascii="Times New Roman" w:hAnsi="Times New Roman" w:cs="Times New Roman"/>
               </w:rPr>
-              <w:t>1,070,000</w:t>
+              <w:t>1,0</w:t>
+            </w:r>
+            <w:r>
+              <w:rPr>
+                <w:rFonts w:ascii="Times New Roman" w:hAnsi="Times New Roman" w:cs="Times New Roman"/>
+              </w:rPr>
+              <w:t>65</w:t>
+            </w:r>
+            <w:r>
+              <w:rPr>
+                <w:rFonts w:ascii="Times New Roman" w:hAnsi="Times New Roman" w:cs="Times New Roman"/>
+              </w:rPr>
+              <w:t>,</w:t>
+            </w:r>
+            <w:r>
+              <w:rPr>
+                <w:rFonts w:ascii="Times New Roman" w:hAnsi="Times New Roman" w:cs="Times New Roman"/>
+              </w:rPr>
+              <w:t>405</w:t>
             </w:r>
           </w:p>
         </w:tc>
@@ -1619,7 +1667,31 @@
               <w:rPr>
                 <w:rFonts w:ascii="Times New Roman" w:hAnsi="Times New Roman" w:cs="Times New Roman"/>
               </w:rPr>
-              <w:t>1,210,000</w:t>
+              <w:t>1,20</w:t>
+            </w:r>
+            <w:r>
+              <w:rPr>
+                <w:rFonts w:ascii="Times New Roman" w:hAnsi="Times New Roman" w:cs="Times New Roman"/>
+              </w:rPr>
+              <w:t>6</w:t>
+            </w:r>
+            <w:r>
+              <w:rPr>
+                <w:rFonts w:ascii="Times New Roman" w:hAnsi="Times New Roman" w:cs="Times New Roman"/>
+              </w:rPr>
+              <w:t>,</w:t>
+            </w:r>
+            <w:r>
+              <w:rPr>
+                <w:rFonts w:ascii="Times New Roman" w:hAnsi="Times New Roman" w:cs="Times New Roman"/>
+              </w:rPr>
+              <w:t>7</w:t>
+            </w:r>
+            <w:r>
+              <w:rPr>
+                <w:rFonts w:ascii="Times New Roman" w:hAnsi="Times New Roman" w:cs="Times New Roman"/>
+              </w:rPr>
+              <w:t>00</w:t>
             </w:r>
           </w:p>
         </w:tc>
@@ -1663,7 +1735,25 @@
               <w:rPr>
                 <w:rFonts w:ascii="Times New Roman" w:hAnsi="Times New Roman" w:cs="Times New Roman"/>
               </w:rPr>
-              <w:t>1,220,000</w:t>
+              <w:t>1,22</w:t>
+            </w:r>
+            <w:r>
+              <w:rPr>
+                <w:rFonts w:ascii="Times New Roman" w:hAnsi="Times New Roman" w:cs="Times New Roman"/>
+              </w:rPr>
+              <w:t>4</w:t>
+            </w:r>
+            <w:r>
+              <w:rPr>
+                <w:rFonts w:ascii="Times New Roman" w:hAnsi="Times New Roman" w:cs="Times New Roman"/>
+              </w:rPr>
+              <w:t>,</w:t>
+            </w:r>
+            <w:r>
+              <w:rPr>
+                <w:rFonts w:ascii="Times New Roman" w:hAnsi="Times New Roman" w:cs="Times New Roman"/>
+              </w:rPr>
+              <w:t>500</w:t>
             </w:r>
           </w:p>
         </w:tc>
@@ -1909,7 +1999,13 @@
               <w:rPr>
                 <w:rFonts w:ascii="Times New Roman" w:hAnsi="Times New Roman" w:cs="Times New Roman"/>
               </w:rPr>
-              <w:t>≈3,000</w:t>
+              <w:t>≈3,</w:t>
+            </w:r>
+            <w:r>
+              <w:rPr>
+                <w:rFonts w:ascii="Times New Roman" w:hAnsi="Times New Roman" w:cs="Times New Roman"/>
+              </w:rPr>
+              <w:t>300</w:t>
             </w:r>
           </w:p>
         </w:tc>
@@ -2633,7 +2729,49 @@
         <w:rPr>
           <w:rFonts w:ascii="Times New Roman" w:hAnsi="Times New Roman" w:cs="Times New Roman"/>
         </w:rPr>
-        <w:t>continued reductions of approximately 15% annually,</w:t>
+        <w:t xml:space="preserve">continued reductions of approximately </w:t>
+      </w:r>
+      <w:r>
+        <w:rPr>
+          <w:rFonts w:ascii="Times New Roman" w:hAnsi="Times New Roman" w:cs="Times New Roman"/>
+        </w:rPr>
+        <w:t>30</w:t>
+      </w:r>
+      <w:r>
+        <w:rPr>
+          <w:rFonts w:ascii="Times New Roman" w:hAnsi="Times New Roman" w:cs="Times New Roman"/>
+        </w:rPr>
+        <w:t xml:space="preserve">% </w:t>
+      </w:r>
+      <w:r>
+        <w:rPr>
+          <w:rFonts w:ascii="Times New Roman" w:hAnsi="Times New Roman" w:cs="Times New Roman"/>
+        </w:rPr>
+        <w:t>(</w:t>
+      </w:r>
+      <w:r>
+        <w:rPr>
+          <w:rFonts w:ascii="Times New Roman" w:hAnsi="Times New Roman" w:cs="Times New Roman"/>
+        </w:rPr>
+        <w:t xml:space="preserve">2023 </w:t>
+      </w:r>
+      <w:r>
+        <w:rPr>
+          <w:rFonts w:ascii="Times New Roman" w:hAnsi="Times New Roman" w:cs="Times New Roman"/>
+        </w:rPr>
+        <w:t>–</w:t>
+      </w:r>
+      <w:r>
+        <w:rPr>
+          <w:rFonts w:ascii="Times New Roman" w:hAnsi="Times New Roman" w:cs="Times New Roman"/>
+        </w:rPr>
+        <w:t xml:space="preserve"> 2024</w:t>
+      </w:r>
+      <w:r>
+        <w:rPr>
+          <w:rFonts w:ascii="Times New Roman" w:hAnsi="Times New Roman" w:cs="Times New Roman"/>
+        </w:rPr>
+        <w:t>) and 13% (2024 - 2025</w:t>
       </w:r>
     </w:p>
     <w:p>

</xml_diff>